<commit_message>
Rewrite user guide for MSIX installation
</commit_message>
<xml_diff>
--- a/EPM_Policy_Builder_Technical_User_Guide.docx
+++ b/EPM_Policy_Builder_Technical_User_Guide.docx
@@ -69,7 +69,7 @@
           <w:sz w:val="20"/>
           <w:szCs w:val="20"/>
         </w:rPr>
-        <w:t xml:space="preserve">12 July 2026</w:t>
+        <w:t xml:space="preserve">15 July 2026</w:t>
       </w:r>
     </w:p>
     <w:p>
@@ -266,20 +266,20 @@
         <w:spacing w:after="80"/>
       </w:pPr>
       <w:r>
-        <w:t xml:space="preserve">Developer Mode enabled (Settings &gt; System &gt; For developers) — required to deploy and run packaged WinUI 3 apps locally.</w:t>
-      </w:r>
-    </w:p>
-    <w:p>
-      <w:pPr>
-        <w:pStyle w:val="ListParagraph"/>
-        <w:numPr>
-          <w:ilvl w:val="0"/>
-          <w:numId w:val="2"/>
-        </w:numPr>
-        <w:spacing w:after="80"/>
-      </w:pPr>
-      <w:r>
-        <w:t xml:space="preserve">.NET 10 SDK if building from source (the app targets net10.0-windows10.0.26100.0).</w:t>
+        <w:t xml:space="preserve">The correct installer package for the device architecture: x64 for Intel/AMD PCs, ARM64 for Windows on ARM devices.</w:t>
+      </w:r>
+    </w:p>
+    <w:p>
+      <w:pPr>
+        <w:pStyle w:val="ListParagraph"/>
+        <w:numPr>
+          <w:ilvl w:val="0"/>
+          <w:numId w:val="2"/>
+        </w:numPr>
+        <w:spacing w:after="80"/>
+      </w:pPr>
+      <w:r>
+        <w:t xml:space="preserve">If the installer is signed with a self-signed or internal certificate, the corresponding certificate must be trusted on the target machine before installation. Developer Mode can also be used for local testing, but it is not required when the signing certificate is already trusted.</w:t>
       </w:r>
     </w:p>
     <w:p>
@@ -355,7 +355,7 @@
         <w:spacing w:after="160"/>
       </w:pPr>
       <w:r>
-        <w:t xml:space="preserve">EPM Policy Builder can be run in two ways: from source using the included build script, or as a packaged app after publishing an MSIX.</w:t>
+        <w:t xml:space="preserve">EPM Policy Builder is intended to be installed as an MSIX package. Use the installer that matches the target device architecture, then launch the app from the Start menu like any other Windows desktop application.</w:t>
       </w:r>
     </w:p>
     <w:p>
@@ -363,7 +363,75 @@
         <w:pStyle w:val="Heading2"/>
       </w:pPr>
       <w:r>
-        <w:t xml:space="preserve">3.1 Running from source</w:t>
+        <w:t xml:space="preserve">3.1 Choose the correct installer</w:t>
+      </w:r>
+    </w:p>
+    <w:p>
+      <w:pPr>
+        <w:pStyle w:val="ListParagraph"/>
+        <w:numPr>
+          <w:ilvl w:val="0"/>
+          <w:numId w:val="3"/>
+        </w:numPr>
+        <w:spacing w:after="80"/>
+      </w:pPr>
+      <w:r>
+        <w:t xml:space="preserve">Use the x64 installer on Intel or AMD-based Windows PCs: EPMPolicyBuilder_1.0.0.0_x64.msix.</w:t>
+      </w:r>
+    </w:p>
+    <w:p>
+      <w:pPr>
+        <w:pStyle w:val="ListParagraph"/>
+        <w:numPr>
+          <w:ilvl w:val="0"/>
+          <w:numId w:val="3"/>
+        </w:numPr>
+        <w:spacing w:after="80"/>
+      </w:pPr>
+      <w:r>
+        <w:t xml:space="preserve">Use the ARM64 installer on Windows on ARM devices: EPMPolicyBuilder_1.0.0.0_arm64.msix.</w:t>
+      </w:r>
+    </w:p>
+    <w:p>
+      <w:pPr>
+        <w:pStyle w:val="ListParagraph"/>
+        <w:numPr>
+          <w:ilvl w:val="0"/>
+          <w:numId w:val="3"/>
+        </w:numPr>
+        <w:spacing w:after="80"/>
+      </w:pPr>
+      <w:r>
+        <w:t xml:space="preserve">Distribute the MSIX file from your internal software portal, GitHub release, file share, or another trusted software distribution channel.</w:t>
+      </w:r>
+    </w:p>
+    <w:p>
+      <w:pPr>
+        <w:pBdr>
+          <w:left w:val="single" w:color="2E75B6" w:sz="24"/>
+        </w:pBdr>
+        <w:shd w:fill="EAF1FB" w:val="clear"/>
+        <w:spacing w:after="160" w:before="120"/>
+        <w:ind w:left="200"/>
+      </w:pPr>
+      <w:r>
+        <w:rPr>
+          <w:b/>
+          <w:bCs/>
+          <w:color w:val="2E75B6"/>
+        </w:rPr>
+        <w:t xml:space="preserve">Architecture check: </w:t>
+      </w:r>
+      <w:r>
+        <w:t xml:space="preserve">If you are not sure which installer to use, open Settings &gt; System &gt; About and check System type. Most business laptops and desktops will use the x64 package.</w:t>
+      </w:r>
+    </w:p>
+    <w:p>
+      <w:pPr>
+        <w:pStyle w:val="Heading2"/>
+      </w:pPr>
+      <w:r>
+        <w:t xml:space="preserve">3.2 Install the MSIX package</w:t>
       </w:r>
     </w:p>
     <w:p>
@@ -371,15 +439,54 @@
         <w:spacing w:after="160"/>
       </w:pPr>
       <w:r>
-        <w:t xml:space="preserve">From the project root (</w:t>
+        <w:t xml:space="preserve">Before installation, make sure the signing certificate is already trusted on the device if the package was signed with an internal or self-signed certificate.</w:t>
+      </w:r>
+    </w:p>
+    <w:p>
+      <w:pPr>
+        <w:pStyle w:val="ListParagraph"/>
+        <w:numPr>
+          <w:ilvl w:val="0"/>
+          <w:numId w:val="3"/>
+        </w:numPr>
+        <w:spacing w:after="80"/>
+      </w:pPr>
+      <w:r>
+        <w:t xml:space="preserve">Download the correct .msix package to the target Windows device.</w:t>
+      </w:r>
+    </w:p>
+    <w:p>
+      <w:pPr>
+        <w:pStyle w:val="ListParagraph"/>
+        <w:numPr>
+          <w:ilvl w:val="0"/>
+          <w:numId w:val="3"/>
+        </w:numPr>
+        <w:spacing w:after="80"/>
+      </w:pPr>
+      <w:r>
+        <w:t xml:space="preserve">Double-click the .msix file and select Install in the App Installer window.</w:t>
+      </w:r>
+    </w:p>
+    <w:p>
+      <w:pPr>
+        <w:pStyle w:val="ListParagraph"/>
+        <w:numPr>
+          <w:ilvl w:val="0"/>
+          <w:numId w:val="3"/>
+        </w:numPr>
+        <w:spacing w:after="80"/>
+      </w:pPr>
+      <w:r>
+        <w:t xml:space="preserve">If your environment prefers command-line deployment, install the package from an elevated PowerShell session using:</w:t>
       </w:r>
     </w:p>
     <w:p>
       <w:pPr>
         <w:pBdr>
           <w:top w:val="single" w:color="CCCCCC" w:sz="2"/>
+          <w:bottom w:val="single" w:color="CCCCCC" w:sz="2"/>
           <w:left w:val="single" w:color="CCCCCC" w:sz="2"/>
-          <w:bottom w:val="single" w:color="CCCCCC" w:sz="2"/>
           <w:right w:val="single" w:color="CCCCCC" w:sz="2"/>
         </w:pBdr>
         <w:shd w:fill="F3F3F3" w:val="clear"/>
@@ -391,7 +498,7 @@
           <w:sz w:val="19"/>
           <w:szCs w:val="19"/>
         </w:rPr>
-        <w:t xml:space="preserve">C:\Users\PerLarsen\OneDrive - Osddeployment\EPMPolicyBuilder</w:t>
+        <w:t xml:space="preserve">Add-AppxPackage .\EPMPolicyBuilder_1.0.0.0_x64.msix</w:t>
       </w:r>
     </w:p>
     <w:p>
@@ -399,134 +506,28 @@
         <w:spacing w:after="160"/>
       </w:pPr>
       <w:r>
-        <w:t xml:space="preserve">run the bundled build helper:</w:t>
+        <w:t xml:space="preserve">For ARM64 devices, use the ARM64 package path in the same command.</w:t>
       </w:r>
     </w:p>
     <w:p>
       <w:pPr>
         <w:pBdr>
-          <w:top w:val="single" w:color="CCCCCC" w:sz="2"/>
-          <w:left w:val="single" w:color="CCCCCC" w:sz="2"/>
-          <w:bottom w:val="single" w:color="CCCCCC" w:sz="2"/>
-          <w:right w:val="single" w:color="CCCCCC" w:sz="2"/>
+          <w:left w:val="single" w:color="2E75B6" w:sz="24"/>
         </w:pBdr>
-        <w:shd w:fill="F3F3F3" w:val="clear"/>
-        <w:spacing w:after="160" w:before="80"/>
+        <w:shd w:fill="EAF1FB" w:val="clear"/>
+        <w:spacing w:after="160" w:before="120"/>
+        <w:ind w:left="200"/>
       </w:pPr>
       <w:r>
         <w:rPr>
-          <w:rFonts w:ascii="Consolas" w:cs="Consolas" w:eastAsia="Consolas" w:hAnsi="Consolas"/>
-          <w:sz w:val="19"/>
-          <w:szCs w:val="19"/>
+          <w:b/>
+          <w:bCs/>
+          <w:color w:val="2E75B6"/>
         </w:rPr>
-        <w:t xml:space="preserve">.\BuildAndRun.ps1 EPMPolicyBuilder.csproj</w:t>
-      </w:r>
-    </w:p>
-    <w:p>
-      <w:pPr>
-        <w:spacing w:after="160"/>
-      </w:pPr>
-      <w:r>
-        <w:t xml:space="preserve">The script:</w:t>
-      </w:r>
-    </w:p>
-    <w:p>
-      <w:pPr>
-        <w:pStyle w:val="ListParagraph"/>
-        <w:numPr>
-          <w:ilvl w:val="0"/>
-          <w:numId w:val="3"/>
-        </w:numPr>
-        <w:spacing w:after="80"/>
-      </w:pPr>
-      <w:r>
-        <w:t xml:space="preserve">Confirms Developer Mode is enabled (fails fast with instructions if not).</w:t>
-      </w:r>
-    </w:p>
-    <w:p>
-      <w:pPr>
-        <w:pStyle w:val="ListParagraph"/>
-        <w:numPr>
-          <w:ilvl w:val="0"/>
-          <w:numId w:val="3"/>
-        </w:numPr>
-        <w:spacing w:after="80"/>
-      </w:pPr>
-      <w:r>
-        <w:t xml:space="preserve">Auto-detects the platform (x64 or ARM64) and defaults to a Debug build.</w:t>
-      </w:r>
-    </w:p>
-    <w:p>
-      <w:pPr>
-        <w:pStyle w:val="ListParagraph"/>
-        <w:numPr>
-          <w:ilvl w:val="0"/>
-          <w:numId w:val="3"/>
-        </w:numPr>
-        <w:spacing w:after="80"/>
-      </w:pPr>
-      <w:r>
-        <w:t xml:space="preserve">Locates MSBuild via vswhere, falling back to “dotnet build” if Visual Studio is not installed.</w:t>
-      </w:r>
-    </w:p>
-    <w:p>
-      <w:pPr>
-        <w:pStyle w:val="ListParagraph"/>
-        <w:numPr>
-          <w:ilvl w:val="0"/>
-          <w:numId w:val="3"/>
-        </w:numPr>
-        <w:spacing w:after="80"/>
-      </w:pPr>
-      <w:r>
-        <w:t xml:space="preserve">Launches the built app using the winapp CLI once the build succeeds.</w:t>
-      </w:r>
-    </w:p>
-    <w:p>
-      <w:pPr>
-        <w:spacing w:after="160"/>
-      </w:pPr>
-      <w:r>
-        <w:t xml:space="preserve">Useful variations:</w:t>
-      </w:r>
-    </w:p>
-    <w:p>
-      <w:pPr>
-        <w:pStyle w:val="ListParagraph"/>
-        <w:numPr>
-          <w:ilvl w:val="0"/>
-          <w:numId w:val="2"/>
-        </w:numPr>
-        <w:spacing w:after="80"/>
-      </w:pPr>
-      <w:r>
-        <w:t xml:space="preserve">Build only, without launching: .\BuildAndRun.ps1 EPMPolicyBuilder.csproj -SkipRun</w:t>
-      </w:r>
-    </w:p>
-    <w:p>
-      <w:pPr>
-        <w:pStyle w:val="ListParagraph"/>
-        <w:numPr>
-          <w:ilvl w:val="0"/>
-          <w:numId w:val="2"/>
-        </w:numPr>
-        <w:spacing w:after="80"/>
-      </w:pPr>
-      <w:r>
-        <w:t xml:space="preserve">Launch detached (background): .\BuildAndRun.ps1 EPMPolicyBuilder.csproj -Detach</w:t>
-      </w:r>
-    </w:p>
-    <w:p>
-      <w:pPr>
-        <w:pStyle w:val="ListParagraph"/>
-        <w:numPr>
-          <w:ilvl w:val="0"/>
-          <w:numId w:val="2"/>
-        </w:numPr>
-        <w:spacing w:after="80"/>
-      </w:pPr>
-      <w:r>
-        <w:t xml:space="preserve">Override configuration: .\BuildAndRun.ps1 EPMPolicyBuilder.csproj /p:Configuration=Release</w:t>
+        <w:t xml:space="preserve">Certificate trust: </w:t>
+      </w:r>
+      <w:r>
+        <w:t xml:space="preserve">If Windows reports that the publisher is not trusted, install the signing certificate into the local machine or current user trust store first, then run the installer again. In production, use a certificate that is already trusted across managed devices.</w:t>
       </w:r>
     </w:p>
     <w:p>
@@ -534,15 +535,80 @@
         <w:pStyle w:val="Heading2"/>
       </w:pPr>
       <w:r>
-        <w:t xml:space="preserve">3.2 Running a packaged build</w:t>
-      </w:r>
-    </w:p>
-    <w:p>
-      <w:pPr>
-        <w:spacing w:after="160"/>
-      </w:pPr>
-      <w:r>
-        <w:t xml:space="preserve">For distribution to other administrators, publish the project as an MSIX package (Solution Explorer &gt; Package and Publish, or dotnet publish with the appropriate publish profile) and install it on the target machine. Developer Mode or a trusted signing certificate is required to install a self-signed MSIX outside the Microsoft Store.</w:t>
+        <w:t xml:space="preserve">3.3 Launch and begin using the app</w:t>
+      </w:r>
+    </w:p>
+    <w:p>
+      <w:pPr>
+        <w:pStyle w:val="ListParagraph"/>
+        <w:numPr>
+          <w:ilvl w:val="0"/>
+          <w:numId w:val="3"/>
+        </w:numPr>
+        <w:spacing w:after="80"/>
+      </w:pPr>
+      <w:r>
+        <w:t xml:space="preserve">Open Start, search for EPM Policy Builder, and launch the app.</w:t>
+      </w:r>
+    </w:p>
+    <w:p>
+      <w:pPr>
+        <w:pStyle w:val="ListParagraph"/>
+        <w:numPr>
+          <w:ilvl w:val="0"/>
+          <w:numId w:val="3"/>
+        </w:numPr>
+        <w:spacing w:after="80"/>
+      </w:pPr>
+      <w:r>
+        <w:t xml:space="preserve">On first launch, open Settings from the navigation footer and complete Quick Setup or enter an existing Client ID and Tenant ID.</w:t>
+      </w:r>
+    </w:p>
+    <w:p>
+      <w:pPr>
+        <w:pStyle w:val="ListParagraph"/>
+        <w:numPr>
+          <w:ilvl w:val="0"/>
+          <w:numId w:val="3"/>
+        </w:numPr>
+        <w:spacing w:after="80"/>
+      </w:pPr>
+      <w:r>
+        <w:t xml:space="preserve">Use Connect to Intune to sign in with an account that has the required Intune and Graph access.</w:t>
+      </w:r>
+    </w:p>
+    <w:p>
+      <w:pPr>
+        <w:pStyle w:val="ListParagraph"/>
+        <w:numPr>
+          <w:ilvl w:val="0"/>
+          <w:numId w:val="3"/>
+        </w:numPr>
+        <w:spacing w:after="80"/>
+      </w:pPr>
+      <w:r>
+        <w:t xml:space="preserve">After connection succeeds, use File Analysis, Rule Builder, Drive Scanner, Rule Suggestions, Certificates, and Policy Upload as described in the walkthrough sections later in this guide.</w:t>
+      </w:r>
+    </w:p>
+    <w:p>
+      <w:pPr>
+        <w:pBdr>
+          <w:left w:val="single" w:color="2E75B6" w:sz="24"/>
+        </w:pBdr>
+        <w:shd w:fill="EAF1FB" w:val="clear"/>
+        <w:spacing w:after="160" w:before="120"/>
+        <w:ind w:left="200"/>
+      </w:pPr>
+      <w:r>
+        <w:rPr>
+          <w:b/>
+          <w:bCs/>
+          <w:color w:val="2E75B6"/>
+        </w:rPr>
+        <w:t xml:space="preserve">Updates: </w:t>
+      </w:r>
+      <w:r>
+        <w:t xml:space="preserve">Installing a newer MSIX package with the same package identity upgrades the existing installation in place. End users do not need to uninstall the previous version first.</w:t>
       </w:r>
     </w:p>
     <w:p>

</xml_diff>